<commit_message>
docs: rewrite Module Five skills plan to match the level as built
The level was blocked out inside the project's existing map rather than
as a separate practice level, so the plan now says that instead of
describing the tutorial level as something to fold in later. Tense
corrected where the skills have already been applied, and the collision
findings written up as the tutorial's practical takeaway.

Co-Authored-By: Claude Opus 5 <noreply@anthropic.com>
</commit_message>
<xml_diff>
--- a/docs/ModuleFive-SkillsImplementationPlan_Thrush.docx
+++ b/docs/ModuleFive-SkillsImplementationPlan_Thrush.docx
@@ -24,17 +24,17 @@
     </w:p>
     <w:p>
       <w:r>
-        <w:t>The modeling and blockout skills from this tutorial apply directly to Echoes of the Vault because my design document requires the entire level to be built from basic geometry with no Starter Content or asset packs. I will use the engine modeling tools to build every room of the vault out of primitives, then carve the doorways and window openings the same way I carved them into the building in the tutorial level. Blocking the level out this way lets me test player movement, room scale, and sightlines before committing to any final art, which is the industry standard order of operations the tutorial demonstrated.</w:t>
+        <w:t>The modeling and blockout skills from this tutorial applied directly to my final project, Echoes of the Vault, because my design document requires the level to be built from basic geometry with no Starter Content or asset packs. Rather than building a separate practice level, I completed the tutorial work inside my project's existing map, so the geometry I created in this tutorial is the prototype's actual level instead of something I would have to rebuild later. I used the engine modeling tools to create the primitives for the ground, the obstacles, and an enterable building, and I used the same carving technique from the tutorial to cut the door and window openings into the walls. For the rest of the project I will keep using this process to block out the remaining spaces with primitives before any final art is added, which is the industry standard order of operations the tutorial demonstrated.</w:t>
       </w:r>
     </w:p>
     <w:p>
       <w:r>
-        <w:t>The level flow techniques are the part I expect to use the most. My design document requires a single continuous level that guides the player without handholding, so instead of waypoints or arrows I will use the framing and sightline methods from the tutorial. Each doorway will frame the next objective so the player can see where to go from where they are already standing, and I will use elevation changes and lighting to pull attention toward the puzzle rooms. The timed puzzle room and the colored button room will both be laid out so that the door the player needs to open is visible from the entrance, which makes the goal obvious without having to explain it.</w:t>
+        <w:t>The level flow and player guidance techniques are the part I expect to keep using the most. My design document requires a single continuous level that guides the player without handholding, so instead of waypoints or markers I used the framing and sightline methods from the tutorial. The building entrance is placed so that the player can see it from the starting area, and the doorways frame what comes next so the player always has something drawing them forward. I laid the puzzle area out so the locked door is visible as soon as the player walks in, which makes the goal obvious without any text explaining it, and I will use the same approach when I lay out the timed puzzle room and the boss arena in the final phase.</w:t>
       </w:r>
     </w:p>
     <w:p>
       <w:r>
-        <w:t>I also plan to reuse the outdoor level I built in this tutorial as the opening of the final project. The enterable building becomes the surface entrance to the vault, with a stairwell inside that leads down into the underground rooms, which keeps the prototype as one continuous level instead of separate disconnected maps. One practical lesson I will carry forward is that carved openings need complex collision rather than simplified box collision, because a box collision seals the doorway and stops the player from walking through it. I ran into that bug while building this level, and knowing the fix ahead of time will save me the same troubleshooting when I carve the doors and windows inside the vault itself.</w:t>
+        <w:t>The most useful practical lesson from this tutorial was about collision. Geometry created with the modeling tools has no collision on it at all when it is first made, and changing the collision preset does not fix that, because the preset only controls how an object responds to collision rather than creating the collision shape itself. I also learned that simplified box collision seals up any opening carved into a wall, so a carved doorway has to use complex collision instead or the player cannot walk through it. Both of these problems cost me time during this tutorial, and knowing them ahead of time will save me the same troubleshooting when I add the remaining rooms and interactive geometry to the prototype.</w:t>
       </w:r>
     </w:p>
     <w:sectPr>

</xml_diff>